<commit_message>
Resume: Cyber Security Work From Home Internship at Tensai Ventures - Internshala @ Unknown (unknown)
</commit_message>
<xml_diff>
--- a/resumes/Resume_Cyber_Security_Work_From_Home_Inter_Unknown__unknown_.docx
+++ b/resumes/Resume_Cyber_Security_Work_From_Home_Inter_Unknown__unknown_.docx
@@ -117,7 +117,7 @@
         <w:pBdr>
           <w:bottom w:val="single" w:sz="6" w:space="1" w:color="000000"/>
         </w:pBdr>
-        <w:spacing w:before="142" w:after="0"/>
+        <w:spacing w:before="114" w:after="0"/>
       </w:pPr>
       <w:r>
         <w:rPr>
@@ -289,7 +289,7 @@
     </w:p>
     <w:p>
       <w:pPr>
-        <w:spacing w:before="31" w:after="31"/>
+        <w:spacing w:before="24" w:after="24"/>
       </w:pPr>
     </w:p>
     <w:p>
@@ -297,7 +297,7 @@
         <w:pBdr>
           <w:bottom w:val="single" w:sz="6" w:space="1" w:color="000000"/>
         </w:pBdr>
-        <w:spacing w:before="142" w:after="0"/>
+        <w:spacing w:before="114" w:after="0"/>
       </w:pPr>
       <w:r>
         <w:rPr>
@@ -404,16 +404,16 @@
           <w:ilvl w:val="0"/>
           <w:numId w:val="2"/>
         </w:numPr>
-        <w:spacing w:before="13" w:after="38"/>
-      </w:pPr>
-      <w:r>
-        <w:rPr>
-          <w:rFonts w:ascii="Source Sans Pro" w:eastAsia="Source Sans Pro" w:hAnsi="Source Sans Pro" w:cs="Source Sans Pro"/>
-          <w:color w:val="000000"/>
-          <w:sz w:val="19"/>
-          <w:szCs w:val="19"/>
-        </w:rPr>
-        <w:t>Triaged 50+ weekly inventory reimbursement cases by severity and policy, reducing repeat-issue investigation time.</w:t>
+        <w:spacing w:before="13" w:after="34"/>
+      </w:pPr>
+      <w:r>
+        <w:rPr>
+          <w:rFonts w:ascii="Source Sans Pro" w:eastAsia="Source Sans Pro" w:hAnsi="Source Sans Pro" w:cs="Source Sans Pro"/>
+          <w:color w:val="000000"/>
+          <w:sz w:val="19"/>
+          <w:szCs w:val="19"/>
+        </w:rPr>
+        <w:t>Triaged 50+ weekly inventory reimbursement cases by severity and policy eligibility, translating high-volume case review into access governance mindset and exception documentation.</w:t>
       </w:r>
     </w:p>
     <w:p>
@@ -423,16 +423,16 @@
           <w:ilvl w:val="0"/>
           <w:numId w:val="2"/>
         </w:numPr>
-        <w:spacing w:before="13" w:after="38"/>
-      </w:pPr>
-      <w:r>
-        <w:rPr>
-          <w:rFonts w:ascii="Source Sans Pro" w:eastAsia="Source Sans Pro" w:hAnsi="Source Sans Pro" w:cs="Source Sans Pro"/>
-          <w:color w:val="000000"/>
-          <w:sz w:val="19"/>
-          <w:szCs w:val="19"/>
-        </w:rPr>
-        <w:t>Investigated seller claims, identified policy violations and anomalous patterns, and escalated findings to senior reviewers, leading to improved case resolution and reduced risk exposure.</w:t>
+        <w:spacing w:before="13" w:after="34"/>
+      </w:pPr>
+      <w:r>
+        <w:rPr>
+          <w:rFonts w:ascii="Source Sans Pro" w:eastAsia="Source Sans Pro" w:hAnsi="Source Sans Pro" w:cs="Source Sans Pro"/>
+          <w:color w:val="000000"/>
+          <w:sz w:val="19"/>
+          <w:szCs w:val="19"/>
+        </w:rPr>
+        <w:t>Conducted root cause analysis on seller claims, identifying policy violations and anomalous patterns for pattern review and investigation handoffs.</w:t>
       </w:r>
     </w:p>
     <w:p>
@@ -442,16 +442,16 @@
           <w:ilvl w:val="0"/>
           <w:numId w:val="2"/>
         </w:numPr>
-        <w:spacing w:before="13" w:after="38"/>
-      </w:pPr>
-      <w:r>
-        <w:rPr>
-          <w:rFonts w:ascii="Source Sans Pro" w:eastAsia="Source Sans Pro" w:hAnsi="Source Sans Pro" w:cs="Source Sans Pro"/>
-          <w:color w:val="000000"/>
-          <w:sz w:val="19"/>
-          <w:szCs w:val="19"/>
-        </w:rPr>
-        <w:t>Analyzed 200+ weekly cases to identify recurring fraud patterns, flagged them early, and reduced repeat-issue investigation time before escalation, demonstrating proactive risk mitigation.</w:t>
+        <w:spacing w:before="13" w:after="34"/>
+      </w:pPr>
+      <w:r>
+        <w:rPr>
+          <w:rFonts w:ascii="Source Sans Pro" w:eastAsia="Source Sans Pro" w:hAnsi="Source Sans Pro" w:cs="Source Sans Pro"/>
+          <w:color w:val="000000"/>
+          <w:sz w:val="19"/>
+          <w:szCs w:val="19"/>
+        </w:rPr>
+        <w:t>Maintained audit-ready case documentation with findings, decisions, evidence notes, and corrective actions aligned to evidence documentation and decision trails.</w:t>
       </w:r>
     </w:p>
     <w:p>
@@ -461,21 +461,21 @@
           <w:ilvl w:val="0"/>
           <w:numId w:val="2"/>
         </w:numPr>
-        <w:spacing w:before="13" w:after="38"/>
-      </w:pPr>
-      <w:r>
-        <w:rPr>
-          <w:rFonts w:ascii="Source Sans Pro" w:eastAsia="Source Sans Pro" w:hAnsi="Source Sans Pro" w:cs="Source Sans Pro"/>
-          <w:color w:val="000000"/>
-          <w:sz w:val="19"/>
-          <w:szCs w:val="19"/>
-        </w:rPr>
-        <w:t>Documented investigation findings, decisions, evidence notes, and corrective actions in audit-ready case records, ensuring transparent and accountable case management and decision-making processes.</w:t>
-      </w:r>
-    </w:p>
-    <w:p>
-      <w:pPr>
-        <w:spacing w:before="31" w:after="31"/>
+        <w:spacing w:before="13" w:after="34"/>
+      </w:pPr>
+      <w:r>
+        <w:rPr>
+          <w:rFonts w:ascii="Source Sans Pro" w:eastAsia="Source Sans Pro" w:hAnsi="Source Sans Pro" w:cs="Source Sans Pro"/>
+          <w:color w:val="000000"/>
+          <w:sz w:val="19"/>
+          <w:szCs w:val="19"/>
+        </w:rPr>
+        <w:t>Spotted recurring fraud patterns across 200+ weekly cases and flagged repeat issues early, reducing investigation cycles before escalation.</w:t>
+      </w:r>
+    </w:p>
+    <w:p>
+      <w:pPr>
+        <w:spacing w:before="24" w:after="24"/>
         <w:rPr>
           <w:rFonts w:ascii="Source Sans Pro" w:eastAsia="Source Sans Pro" w:hAnsi="Source Sans Pro" w:cs="Source Sans Pro"/>
           <w:b/>
@@ -488,7 +488,7 @@
     </w:p>
     <w:p>
       <w:pPr>
-        <w:spacing w:before="135" w:after="0"/>
+        <w:spacing w:before="107" w:after="0"/>
         <w:rPr>
           <w:rFonts w:ascii="Source Sans Pro" w:eastAsia="Source Sans Pro" w:hAnsi="Source Sans Pro" w:cs="Source Sans Pro"/>
           <w:b/>
@@ -659,7 +659,7 @@
           <w:ilvl w:val="0"/>
           <w:numId w:val="2"/>
         </w:numPr>
-        <w:spacing w:before="13" w:after="38"/>
+        <w:spacing w:before="13" w:after="34"/>
       </w:pPr>
       <w:r>
         <w:rPr>
@@ -678,16 +678,16 @@
           <w:ilvl w:val="0"/>
           <w:numId w:val="2"/>
         </w:numPr>
-        <w:spacing w:before="13" w:after="38"/>
-      </w:pPr>
-      <w:r>
-        <w:rPr>
-          <w:rFonts w:ascii="Source Sans Pro" w:eastAsia="Source Sans Pro" w:hAnsi="Source Sans Pro" w:cs="Source Sans Pro"/>
-          <w:color w:val="000000"/>
-          <w:sz w:val="19"/>
-          <w:szCs w:val="19"/>
-        </w:rPr>
-        <w:t>Developed SOAR-style detection pipeline: Python script ingests Splunk alerts, enriches with VirusTotal API, and dispatches Telegram notifications with CVSS severity classification.</w:t>
+        <w:spacing w:before="33" w:after="33"/>
+      </w:pPr>
+      <w:r>
+        <w:rPr>
+          <w:rFonts w:ascii="Source Sans Pro" w:eastAsia="Source Sans Pro" w:hAnsi="Source Sans Pro" w:cs="Source Sans Pro"/>
+          <w:color w:val="000000"/>
+          <w:sz w:val="19"/>
+          <w:szCs w:val="19"/>
+        </w:rPr>
+        <w:t>Developed SOAR-style pipeline: Python script ingests Splunk alerts, enriches with VirusTotal API, and dispatches Telegram notifications with severity classification.</w:t>
       </w:r>
     </w:p>
     <w:p>
@@ -697,21 +697,21 @@
           <w:ilvl w:val="0"/>
           <w:numId w:val="2"/>
         </w:numPr>
-        <w:spacing w:before="13" w:after="38"/>
-      </w:pPr>
-      <w:r>
-        <w:rPr>
-          <w:rFonts w:ascii="Source Sans Pro" w:eastAsia="Source Sans Pro" w:hAnsi="Source Sans Pro" w:cs="Source Sans Pro"/>
-          <w:color w:val="000000"/>
-          <w:sz w:val="19"/>
-          <w:szCs w:val="19"/>
-        </w:rPr>
-        <w:t>Converted detection logic to Sigma rules for enterprise SOCs; analyzed TCP/IP traffic in Wireshark for SYN scans, DNS tunnelling, and plaintext credential exposure.</w:t>
-      </w:r>
-    </w:p>
-    <w:p>
-      <w:pPr>
-        <w:spacing w:before="31" w:after="31"/>
+        <w:spacing w:before="13" w:after="34"/>
+      </w:pPr>
+      <w:r>
+        <w:rPr>
+          <w:rFonts w:ascii="Source Sans Pro" w:eastAsia="Source Sans Pro" w:hAnsi="Source Sans Pro" w:cs="Source Sans Pro"/>
+          <w:color w:val="000000"/>
+          <w:sz w:val="19"/>
+          <w:szCs w:val="19"/>
+        </w:rPr>
+        <w:t>Converted detection logic to Sigma rules; analyzed TCP/IP traffic in Wireshark for SYN scans, DNS tunnelling, and plaintext credential exposure.</w:t>
+      </w:r>
+    </w:p>
+    <w:p>
+      <w:pPr>
+        <w:spacing w:before="24" w:after="24"/>
       </w:pPr>
     </w:p>
     <w:p>
@@ -767,7 +767,7 @@
           <w:ilvl w:val="0"/>
           <w:numId w:val="2"/>
         </w:numPr>
-        <w:spacing w:before="13" w:after="38"/>
+        <w:spacing w:before="13" w:after="34"/>
       </w:pPr>
       <w:r>
         <w:rPr>
@@ -786,16 +786,16 @@
           <w:ilvl w:val="0"/>
           <w:numId w:val="2"/>
         </w:numPr>
-        <w:spacing w:before="13" w:after="38"/>
-      </w:pPr>
-      <w:r>
-        <w:rPr>
-          <w:rFonts w:ascii="Source Sans Pro" w:eastAsia="Source Sans Pro" w:hAnsi="Source Sans Pro" w:cs="Source Sans Pro"/>
-          <w:color w:val="000000"/>
-          <w:sz w:val="19"/>
-          <w:szCs w:val="19"/>
-        </w:rPr>
-        <w:t>Developed OWASP Top 10 automated web checker to detect web app vulnerabilities, including injection, auth, and SSRF; documented SQL injection remediation.</w:t>
+        <w:spacing w:before="13" w:after="34"/>
+      </w:pPr>
+      <w:r>
+        <w:rPr>
+          <w:rFonts w:ascii="Source Sans Pro" w:eastAsia="Source Sans Pro" w:hAnsi="Source Sans Pro" w:cs="Source Sans Pro"/>
+          <w:color w:val="000000"/>
+          <w:sz w:val="19"/>
+          <w:szCs w:val="19"/>
+        </w:rPr>
+        <w:t>Developed OWASP Top 10 automated web checker to detect injection, auth, and SSRF vulnerabilities; documented SQL injection exploit and remediation.</w:t>
       </w:r>
     </w:p>
     <w:p>
@@ -805,7 +805,7 @@
           <w:ilvl w:val="0"/>
           <w:numId w:val="2"/>
         </w:numPr>
-        <w:spacing w:before="13" w:after="38"/>
+        <w:spacing w:before="13" w:after="34"/>
       </w:pPr>
       <w:r>
         <w:rPr>
@@ -820,7 +820,7 @@
     <w:p>
       <w:pPr>
         <w:pStyle w:val="ListParagraph"/>
-        <w:spacing w:before="31" w:after="31"/>
+        <w:spacing w:before="24" w:after="24"/>
         <w:ind w:left="450"/>
       </w:pPr>
     </w:p>
@@ -829,7 +829,7 @@
         <w:pBdr>
           <w:bottom w:val="single" w:sz="6" w:space="1" w:color="000000"/>
         </w:pBdr>
-        <w:spacing w:before="142" w:after="0"/>
+        <w:spacing w:before="114" w:after="0"/>
       </w:pPr>
       <w:r>
         <w:rPr>
@@ -845,7 +845,7 @@
     </w:p>
     <w:p>
       <w:pPr>
-        <w:spacing w:before="55" w:after="55"/>
+        <w:spacing w:before="44" w:after="44"/>
       </w:pPr>
       <w:r>
         <w:rPr>
@@ -867,7 +867,7 @@
     </w:p>
     <w:p>
       <w:pPr>
-        <w:spacing w:before="55" w:after="55"/>
+        <w:spacing w:before="44" w:after="44"/>
       </w:pPr>
       <w:r>
         <w:rPr>
@@ -889,7 +889,7 @@
     </w:p>
     <w:p>
       <w:pPr>
-        <w:spacing w:before="55" w:after="55"/>
+        <w:spacing w:before="44" w:after="44"/>
       </w:pPr>
       <w:r>
         <w:rPr>
@@ -911,7 +911,7 @@
     </w:p>
     <w:p>
       <w:pPr>
-        <w:spacing w:before="55" w:after="55"/>
+        <w:spacing w:before="44" w:after="44"/>
       </w:pPr>
       <w:r>
         <w:rPr>
@@ -933,7 +933,7 @@
     </w:p>
     <w:p>
       <w:pPr>
-        <w:spacing w:before="55" w:after="44"/>
+        <w:spacing w:before="44" w:after="33"/>
       </w:pPr>
       <w:r>
         <w:rPr>
@@ -958,7 +958,7 @@
         <w:pBdr>
           <w:bottom w:val="single" w:sz="6" w:space="1" w:color="000000"/>
         </w:pBdr>
-        <w:spacing w:before="31" w:after="31"/>
+        <w:spacing w:before="24" w:after="24"/>
         <w:rPr>
           <w:rFonts w:ascii="Source Sans Pro" w:eastAsia="Source Sans Pro" w:hAnsi="Source Sans Pro" w:cs="Source Sans Pro"/>
           <w:b/>
@@ -974,7 +974,7 @@
         <w:pBdr>
           <w:bottom w:val="single" w:sz="6" w:space="1" w:color="000000"/>
         </w:pBdr>
-        <w:spacing w:before="142" w:after="0"/>
+        <w:spacing w:before="114" w:after="0"/>
       </w:pPr>
       <w:r>
         <w:rPr>
@@ -995,7 +995,7 @@
           <w:ilvl w:val="0"/>
           <w:numId w:val="2"/>
         </w:numPr>
-        <w:spacing w:before="13" w:after="38"/>
+        <w:spacing w:before="13" w:after="34"/>
       </w:pPr>
       <w:r>
         <w:rPr>
@@ -1014,7 +1014,7 @@
           <w:ilvl w:val="0"/>
           <w:numId w:val="2"/>
         </w:numPr>
-        <w:spacing w:before="13" w:after="38"/>
+        <w:spacing w:before="13" w:after="34"/>
       </w:pPr>
       <w:r>
         <w:rPr>

</xml_diff>

<commit_message>
Resume: Cyber Security Work From Home Internship at CloudZapier @ Unknown (unknown)
</commit_message>
<xml_diff>
--- a/resumes/Resume_Cyber_Security_Work_From_Home_Inter_Unknown__unknown_.docx
+++ b/resumes/Resume_Cyber_Security_Work_From_Home_Inter_Unknown__unknown_.docx
@@ -117,7 +117,7 @@
         <w:pBdr>
           <w:bottom w:val="single" w:sz="6" w:space="1" w:color="000000"/>
         </w:pBdr>
-        <w:spacing w:before="99" w:after="0"/>
+        <w:spacing w:before="70" w:after="0"/>
       </w:pPr>
       <w:r>
         <w:rPr>
@@ -295,7 +295,7 @@
     </w:p>
     <w:p>
       <w:pPr>
-        <w:spacing w:before="20" w:after="20"/>
+        <w:spacing w:before="13" w:after="13"/>
       </w:pPr>
     </w:p>
     <w:p>
@@ -303,7 +303,7 @@
         <w:pBdr>
           <w:bottom w:val="single" w:sz="6" w:space="1" w:color="000000"/>
         </w:pBdr>
-        <w:spacing w:before="99" w:after="0"/>
+        <w:spacing w:before="70" w:after="0"/>
       </w:pPr>
       <w:r>
         <w:rPr>
@@ -421,16 +421,16 @@
           <w:ilvl w:val="0"/>
           <w:numId w:val="2"/>
         </w:numPr>
-        <w:spacing w:before="13" w:after="30"/>
-      </w:pPr>
-      <w:r>
-        <w:rPr>
-          <w:rFonts w:ascii="Source Sans Pro" w:eastAsia="Source Sans Pro" w:hAnsi="Source Sans Pro" w:cs="Source Sans Pro"/>
-          <w:color w:val="000000"/>
-          <w:sz w:val="19"/>
-          <w:szCs w:val="19"/>
-        </w:rPr>
-        <w:t>Triaged 50+ weekly inventory reimbursement cases by severity and policy eligibility, following structured workflows, with 100% accuracy.</w:t>
+        <w:spacing w:before="13" w:after="23"/>
+      </w:pPr>
+      <w:r>
+        <w:rPr>
+          <w:rFonts w:ascii="Source Sans Pro" w:eastAsia="Source Sans Pro" w:hAnsi="Source Sans Pro" w:cs="Source Sans Pro"/>
+          <w:color w:val="000000"/>
+          <w:sz w:val="19"/>
+          <w:szCs w:val="19"/>
+        </w:rPr>
+        <w:t>Triaged 50+ weekly inventory reimbursement cases by severity and policy eligibility, identifying high-risk cases for senior reviewer escalation.</w:t>
       </w:r>
     </w:p>
     <w:p>
@@ -440,16 +440,16 @@
           <w:ilvl w:val="0"/>
           <w:numId w:val="2"/>
         </w:numPr>
-        <w:spacing w:before="13" w:after="30"/>
-      </w:pPr>
-      <w:r>
-        <w:rPr>
-          <w:rFonts w:ascii="Source Sans Pro" w:eastAsia="Source Sans Pro" w:hAnsi="Source Sans Pro" w:cs="Source Sans Pro"/>
-          <w:color w:val="000000"/>
-          <w:sz w:val="19"/>
-          <w:szCs w:val="19"/>
-        </w:rPr>
-        <w:t>Investigated root cause analysis on seller claims, identifying policy violations and anomalous patterns, with 95% escalation accuracy.</w:t>
+        <w:spacing w:before="13" w:after="23"/>
+      </w:pPr>
+      <w:r>
+        <w:rPr>
+          <w:rFonts w:ascii="Source Sans Pro" w:eastAsia="Source Sans Pro" w:hAnsi="Source Sans Pro" w:cs="Source Sans Pro"/>
+          <w:color w:val="000000"/>
+          <w:sz w:val="19"/>
+          <w:szCs w:val="19"/>
+        </w:rPr>
+        <w:t>Investigated seller claims, analyzing root cause and policy violations to inform decision-making and reduce repeat-issue investigation time.</w:t>
       </w:r>
     </w:p>
     <w:p>
@@ -459,16 +459,16 @@
           <w:ilvl w:val="0"/>
           <w:numId w:val="2"/>
         </w:numPr>
-        <w:spacing w:before="13" w:after="30"/>
-      </w:pPr>
-      <w:r>
-        <w:rPr>
-          <w:rFonts w:ascii="Source Sans Pro" w:eastAsia="Source Sans Pro" w:hAnsi="Source Sans Pro" w:cs="Source Sans Pro"/>
-          <w:color w:val="000000"/>
-          <w:sz w:val="19"/>
-          <w:szCs w:val="19"/>
-        </w:rPr>
-        <w:t>Analyzed 200+ weekly cases to spot recurring fraud patterns, reducing repeat-issue investigation time by 30% before escalation.</w:t>
+        <w:spacing w:before="13" w:after="23"/>
+      </w:pPr>
+      <w:r>
+        <w:rPr>
+          <w:rFonts w:ascii="Source Sans Pro" w:eastAsia="Source Sans Pro" w:hAnsi="Source Sans Pro" w:cs="Source Sans Pro"/>
+          <w:color w:val="000000"/>
+          <w:sz w:val="19"/>
+          <w:szCs w:val="19"/>
+        </w:rPr>
+        <w:t>Analyzed 200+ weekly cases for recurring fraud patterns, detecting anomalies and flagging them early to prevent repeat issues.</w:t>
       </w:r>
     </w:p>
     <w:p>
@@ -478,16 +478,16 @@
           <w:ilvl w:val="0"/>
           <w:numId w:val="2"/>
         </w:numPr>
-        <w:spacing w:before="13" w:after="30"/>
-      </w:pPr>
-      <w:r>
-        <w:rPr>
-          <w:rFonts w:ascii="Source Sans Pro" w:eastAsia="Source Sans Pro" w:hAnsi="Source Sans Pro" w:cs="Source Sans Pro"/>
-          <w:color w:val="000000"/>
-          <w:sz w:val="19"/>
-          <w:szCs w:val="19"/>
-        </w:rPr>
-        <w:t>Documented audit-ready case records, including investigation findings, decisions, evidence notes, and corrective actions, with 99% accuracy.</w:t>
+        <w:spacing w:before="13" w:after="23"/>
+      </w:pPr>
+      <w:r>
+        <w:rPr>
+          <w:rFonts w:ascii="Source Sans Pro" w:eastAsia="Source Sans Pro" w:hAnsi="Source Sans Pro" w:cs="Source Sans Pro"/>
+          <w:color w:val="000000"/>
+          <w:sz w:val="19"/>
+          <w:szCs w:val="19"/>
+        </w:rPr>
+        <w:t>Documented investigation findings, decisions, evidence notes, and corrective actions in audit-ready case records, maintaining accurate and transparent case histories.</w:t>
       </w:r>
     </w:p>
     <w:p>
@@ -495,7 +495,7 @@
         <w:pBdr>
           <w:bottom w:val="single" w:sz="6" w:space="1" w:color="000000"/>
         </w:pBdr>
-        <w:spacing w:before="20" w:after="20"/>
+        <w:spacing w:before="13" w:after="13"/>
         <w:rPr>
           <w:rFonts w:ascii="Source Sans Pro" w:eastAsia="Source Sans Pro" w:hAnsi="Source Sans Pro" w:cs="Source Sans Pro"/>
           <w:b/>
@@ -511,7 +511,7 @@
         <w:pBdr>
           <w:bottom w:val="single" w:sz="6" w:space="1" w:color="000000"/>
         </w:pBdr>
-        <w:spacing w:before="99" w:after="0"/>
+        <w:spacing w:before="70" w:after="0"/>
       </w:pPr>
       <w:r>
         <w:rPr>
@@ -579,16 +579,16 @@
           <w:ilvl w:val="0"/>
           <w:numId w:val="2"/>
         </w:numPr>
-        <w:spacing w:before="13" w:after="30"/>
-      </w:pPr>
-      <w:r>
-        <w:rPr>
-          <w:rFonts w:ascii="Source Sans Pro" w:eastAsia="Source Sans Pro" w:hAnsi="Source Sans Pro" w:cs="Source Sans Pro"/>
-          <w:color w:val="000000"/>
-          <w:sz w:val="19"/>
-          <w:szCs w:val="19"/>
-        </w:rPr>
-        <w:t>Deployed Splunk SIEM with SPL correlation searches for brute-force detection, lateral movement, and privilege escalation; mapped TTPs to MITRE ATT&amp;CK and wrote PICERL incident report for FIRST.org.</w:t>
+        <w:spacing w:before="13" w:after="23"/>
+      </w:pPr>
+      <w:r>
+        <w:rPr>
+          <w:rFonts w:ascii="Source Sans Pro" w:eastAsia="Source Sans Pro" w:hAnsi="Source Sans Pro" w:cs="Source Sans Pro"/>
+          <w:color w:val="000000"/>
+          <w:sz w:val="19"/>
+          <w:szCs w:val="19"/>
+        </w:rPr>
+        <w:t>Developed structured escalation workflow using Splunk SIEM with SPL correlation searches for brute-force detection, lateral movement, and privilege escalation; mapped TTPs to MITRE ATT&amp;CK and wrote PICERL incident report for FIRST.org.</w:t>
       </w:r>
     </w:p>
     <w:p>
@@ -598,16 +598,16 @@
           <w:ilvl w:val="0"/>
           <w:numId w:val="2"/>
         </w:numPr>
-        <w:spacing w:before="13" w:after="30"/>
-      </w:pPr>
-      <w:r>
-        <w:rPr>
-          <w:rFonts w:ascii="Source Sans Pro" w:eastAsia="Source Sans Pro" w:hAnsi="Source Sans Pro" w:cs="Source Sans Pro"/>
-          <w:color w:val="000000"/>
-          <w:sz w:val="19"/>
-          <w:szCs w:val="19"/>
-        </w:rPr>
-        <w:t>Developed SOAR-style detection pipeline using Python, ingesting Splunk alerts, enriching with VirusTotal API, and dispatching Telegram notifications with severity classification.</w:t>
+        <w:spacing w:before="13" w:after="23"/>
+      </w:pPr>
+      <w:r>
+        <w:rPr>
+          <w:rFonts w:ascii="Source Sans Pro" w:eastAsia="Source Sans Pro" w:hAnsi="Source Sans Pro" w:cs="Source Sans Pro"/>
+          <w:color w:val="000000"/>
+          <w:sz w:val="19"/>
+          <w:szCs w:val="19"/>
+        </w:rPr>
+        <w:t>Developed Python pipeline ingesting Splunk alerts, enriching with VirusTotal API, and dispatching Telegram notifications with CVSS severity classification.</w:t>
       </w:r>
     </w:p>
     <w:p>
@@ -617,7 +617,7 @@
           <w:ilvl w:val="0"/>
           <w:numId w:val="2"/>
         </w:numPr>
-        <w:spacing w:before="13" w:after="30"/>
+        <w:spacing w:before="13" w:after="23"/>
       </w:pPr>
       <w:r>
         <w:rPr>
@@ -631,7 +631,7 @@
     </w:p>
     <w:p>
       <w:pPr>
-        <w:spacing w:before="20" w:after="20"/>
+        <w:spacing w:before="13" w:after="13"/>
       </w:pPr>
     </w:p>
     <w:p>
@@ -651,7 +651,7 @@
             <w:szCs w:val="19"/>
             <w:u w:val="single"/>
           </w:rPr>
-          <w:t>Severity-Based Vulnerability Prioritization Engine</w:t>
+          <w:t>Vulnerability Scanner and Patch Prioritization Engine</w:t>
         </w:r>
       </w:hyperlink>
       <w:r>
@@ -688,16 +688,16 @@
           <w:ilvl w:val="0"/>
           <w:numId w:val="2"/>
         </w:numPr>
-        <w:spacing w:before="13" w:after="30"/>
-      </w:pPr>
-      <w:r>
-        <w:rPr>
-          <w:rFonts w:ascii="Source Sans Pro" w:eastAsia="Source Sans Pro" w:hAnsi="Source Sans Pro" w:cs="Source Sans Pro"/>
-          <w:color w:val="000000"/>
-          <w:sz w:val="19"/>
-          <w:szCs w:val="19"/>
-        </w:rPr>
-        <w:t>Developed automated vulnerability assessment pipeline integrating Nessus and OpenVAS REST APIs in Python, generating CVE reports with CVSS severity and EPSS context from FIRST.org API.</w:t>
+        <w:spacing w:before="13" w:after="23"/>
+      </w:pPr>
+      <w:r>
+        <w:rPr>
+          <w:rFonts w:ascii="Source Sans Pro" w:eastAsia="Source Sans Pro" w:hAnsi="Source Sans Pro" w:cs="Source Sans Pro"/>
+          <w:color w:val="000000"/>
+          <w:sz w:val="19"/>
+          <w:szCs w:val="19"/>
+        </w:rPr>
+        <w:t>Integrated Nessus and OpenVAS APIs in Python to build automated vulnerability pipeline, generating CVE reports with CVSS severity and EPSS context from FIRST.org API.</w:t>
       </w:r>
     </w:p>
     <w:p>
@@ -707,16 +707,16 @@
           <w:ilvl w:val="0"/>
           <w:numId w:val="2"/>
         </w:numPr>
-        <w:spacing w:before="13" w:after="30"/>
-      </w:pPr>
-      <w:r>
-        <w:rPr>
-          <w:rFonts w:ascii="Source Sans Pro" w:eastAsia="Source Sans Pro" w:hAnsi="Source Sans Pro" w:cs="Source Sans Pro"/>
-          <w:color w:val="000000"/>
-          <w:sz w:val="19"/>
-          <w:szCs w:val="19"/>
-        </w:rPr>
-        <w:t>Developed OWASP Top 10 automated web checker to detect injection, auth, and SSRF vulnerabilities; documented SQL injection exploit and remediation.</w:t>
+        <w:spacing w:before="13" w:after="23"/>
+      </w:pPr>
+      <w:r>
+        <w:rPr>
+          <w:rFonts w:ascii="Source Sans Pro" w:eastAsia="Source Sans Pro" w:hAnsi="Source Sans Pro" w:cs="Source Sans Pro"/>
+          <w:color w:val="000000"/>
+          <w:sz w:val="19"/>
+          <w:szCs w:val="19"/>
+        </w:rPr>
+        <w:t>Developed OWASP Top 10 automated web checker to detect injection, auth, and SSRF vulnerabilities, documenting SQL injection remediation.</w:t>
       </w:r>
     </w:p>
     <w:p>
@@ -726,7 +726,7 @@
           <w:ilvl w:val="0"/>
           <w:numId w:val="2"/>
         </w:numPr>
-        <w:spacing w:before="13" w:after="30"/>
+        <w:spacing w:before="13" w:after="23"/>
       </w:pPr>
       <w:r>
         <w:rPr>
@@ -743,7 +743,7 @@
         <w:pBdr>
           <w:bottom w:val="single" w:sz="6" w:space="1" w:color="000000"/>
         </w:pBdr>
-        <w:spacing w:before="20" w:after="20"/>
+        <w:spacing w:before="13" w:after="13"/>
         <w:rPr>
           <w:rFonts w:ascii="Source Sans Pro" w:eastAsia="Source Sans Pro" w:hAnsi="Source Sans Pro" w:cs="Source Sans Pro"/>
           <w:b/>
@@ -759,7 +759,7 @@
         <w:pBdr>
           <w:bottom w:val="single" w:sz="6" w:space="1" w:color="000000"/>
         </w:pBdr>
-        <w:spacing w:before="99" w:after="0"/>
+        <w:spacing w:before="70" w:after="0"/>
       </w:pPr>
       <w:r>
         <w:rPr>
@@ -775,7 +775,7 @@
     </w:p>
     <w:p>
       <w:pPr>
-        <w:spacing w:before="44" w:after="44"/>
+        <w:spacing w:before="37" w:after="37"/>
       </w:pPr>
       <w:r>
         <w:rPr>
@@ -797,7 +797,7 @@
     </w:p>
     <w:p>
       <w:pPr>
-        <w:spacing w:before="44" w:after="44"/>
+        <w:spacing w:before="37" w:after="37"/>
       </w:pPr>
       <w:r>
         <w:rPr>
@@ -819,7 +819,7 @@
     </w:p>
     <w:p>
       <w:pPr>
-        <w:spacing w:before="44" w:after="44"/>
+        <w:spacing w:before="37" w:after="37"/>
       </w:pPr>
       <w:r>
         <w:rPr>
@@ -841,7 +841,7 @@
     </w:p>
     <w:p>
       <w:pPr>
-        <w:spacing w:before="44" w:after="44"/>
+        <w:spacing w:before="37" w:after="37"/>
       </w:pPr>
       <w:r>
         <w:rPr>
@@ -863,7 +863,7 @@
     </w:p>
     <w:p>
       <w:pPr>
-        <w:spacing w:before="44" w:after="44"/>
+        <w:spacing w:before="37" w:after="37"/>
       </w:pPr>
       <w:r>
         <w:rPr>
@@ -888,7 +888,7 @@
         <w:pBdr>
           <w:bottom w:val="single" w:sz="6" w:space="1" w:color="000000"/>
         </w:pBdr>
-        <w:spacing w:before="20" w:after="20"/>
+        <w:spacing w:before="13" w:after="13"/>
         <w:rPr>
           <w:rFonts w:ascii="Source Sans Pro" w:eastAsia="Source Sans Pro" w:hAnsi="Source Sans Pro" w:cs="Source Sans Pro"/>
           <w:b/>
@@ -904,7 +904,7 @@
         <w:pBdr>
           <w:bottom w:val="single" w:sz="6" w:space="1" w:color="000000"/>
         </w:pBdr>
-        <w:spacing w:before="99" w:after="0"/>
+        <w:spacing w:before="70" w:after="0"/>
       </w:pPr>
       <w:r>
         <w:rPr>
@@ -925,7 +925,7 @@
           <w:ilvl w:val="0"/>
           <w:numId w:val="2"/>
         </w:numPr>
-        <w:spacing w:before="13" w:after="30"/>
+        <w:spacing w:before="13" w:after="23"/>
       </w:pPr>
       <w:r>
         <w:rPr>
@@ -944,7 +944,7 @@
           <w:ilvl w:val="0"/>
           <w:numId w:val="2"/>
         </w:numPr>
-        <w:spacing w:before="13" w:after="30"/>
+        <w:spacing w:before="13" w:after="23"/>
       </w:pPr>
       <w:r>
         <w:rPr>

</xml_diff>

<commit_message>
Resume: Cyber Security Work From Home Internship at Experience My India - Internshala @ Unknown (unknown)
</commit_message>
<xml_diff>
--- a/resumes/Resume_Cyber_Security_Work_From_Home_Inter_Unknown__unknown_.docx
+++ b/resumes/Resume_Cyber_Security_Work_From_Home_Inter_Unknown__unknown_.docx
@@ -117,7 +117,7 @@
         <w:pBdr>
           <w:bottom w:val="single" w:sz="6" w:space="1" w:color="000000"/>
         </w:pBdr>
-        <w:spacing w:before="99" w:after="0"/>
+        <w:spacing w:before="185" w:after="0"/>
       </w:pPr>
       <w:r>
         <w:rPr>
@@ -295,7 +295,7 @@
     </w:p>
     <w:p>
       <w:pPr>
-        <w:spacing w:before="20" w:after="20"/>
+        <w:spacing w:before="41" w:after="41"/>
       </w:pPr>
     </w:p>
     <w:p>
@@ -303,7 +303,7 @@
         <w:pBdr>
           <w:bottom w:val="single" w:sz="6" w:space="1" w:color="000000"/>
         </w:pBdr>
-        <w:spacing w:before="99" w:after="0"/>
+        <w:spacing w:before="185" w:after="0"/>
       </w:pPr>
       <w:r>
         <w:rPr>
@@ -421,16 +421,16 @@
           <w:ilvl w:val="0"/>
           <w:numId w:val="2"/>
         </w:numPr>
-        <w:spacing w:before="13" w:after="30"/>
-      </w:pPr>
-      <w:r>
-        <w:rPr>
-          <w:rFonts w:ascii="Source Sans Pro" w:eastAsia="Source Sans Pro" w:hAnsi="Source Sans Pro" w:cs="Source Sans Pro"/>
-          <w:color w:val="000000"/>
-          <w:sz w:val="19"/>
-          <w:szCs w:val="19"/>
-        </w:rPr>
-        <w:t>Triaged 50+ weekly inventory reimbursement cases by severity and policy, using structured workflows to ensure timely decision-making and reduced escalations.</w:t>
+        <w:spacing w:before="13" w:after="47"/>
+      </w:pPr>
+      <w:r>
+        <w:rPr>
+          <w:rFonts w:ascii="Source Sans Pro" w:eastAsia="Source Sans Pro" w:hAnsi="Source Sans Pro" w:cs="Source Sans Pro"/>
+          <w:color w:val="000000"/>
+          <w:sz w:val="19"/>
+          <w:szCs w:val="19"/>
+        </w:rPr>
+        <w:t>Triaged 50+ weekly inventory reimbursement cases by severity and policy eligibility, translating high-volume case review into structured investigation, escalation, and evidence documentation.</w:t>
       </w:r>
     </w:p>
     <w:p>
@@ -440,16 +440,16 @@
           <w:ilvl w:val="0"/>
           <w:numId w:val="2"/>
         </w:numPr>
-        <w:spacing w:before="13" w:after="30"/>
-      </w:pPr>
-      <w:r>
-        <w:rPr>
-          <w:rFonts w:ascii="Source Sans Pro" w:eastAsia="Source Sans Pro" w:hAnsi="Source Sans Pro" w:cs="Source Sans Pro"/>
-          <w:color w:val="000000"/>
-          <w:sz w:val="19"/>
-          <w:szCs w:val="19"/>
-        </w:rPr>
-        <w:t>Investigated seller claims, identifying policy violations and anomalous patterns, and escalated findings to senior reviewers for informed decision-making.</w:t>
+        <w:spacing w:before="13" w:after="47"/>
+      </w:pPr>
+      <w:r>
+        <w:rPr>
+          <w:rFonts w:ascii="Source Sans Pro" w:eastAsia="Source Sans Pro" w:hAnsi="Source Sans Pro" w:cs="Source Sans Pro"/>
+          <w:color w:val="000000"/>
+          <w:sz w:val="19"/>
+          <w:szCs w:val="19"/>
+        </w:rPr>
+        <w:t>Investigated seller claims, identifying policy violations and anomalous patterns, escalating findings to senior reviewers</w:t>
       </w:r>
     </w:p>
     <w:p>
@@ -459,16 +459,16 @@
           <w:ilvl w:val="0"/>
           <w:numId w:val="2"/>
         </w:numPr>
-        <w:spacing w:before="13" w:after="30"/>
-      </w:pPr>
-      <w:r>
-        <w:rPr>
-          <w:rFonts w:ascii="Source Sans Pro" w:eastAsia="Source Sans Pro" w:hAnsi="Source Sans Pro" w:cs="Source Sans Pro"/>
-          <w:color w:val="000000"/>
-          <w:sz w:val="19"/>
-          <w:szCs w:val="19"/>
-        </w:rPr>
-        <w:t>Maintained audit-ready case documentation with findings, decisions, evidence notes, and corrective actions aligned to evidence documentation and decision trails.</w:t>
+        <w:spacing w:before="13" w:after="47"/>
+      </w:pPr>
+      <w:r>
+        <w:rPr>
+          <w:rFonts w:ascii="Source Sans Pro" w:eastAsia="Source Sans Pro" w:hAnsi="Source Sans Pro" w:cs="Source Sans Pro"/>
+          <w:color w:val="000000"/>
+          <w:sz w:val="19"/>
+          <w:szCs w:val="19"/>
+        </w:rPr>
+        <w:t>Maintained audit-ready documentation, recording investigation findings and evidence notes for 50+ weekly cases</w:t>
       </w:r>
     </w:p>
     <w:p>
@@ -478,16 +478,16 @@
           <w:ilvl w:val="0"/>
           <w:numId w:val="2"/>
         </w:numPr>
-        <w:spacing w:before="13" w:after="30"/>
-      </w:pPr>
-      <w:r>
-        <w:rPr>
-          <w:rFonts w:ascii="Source Sans Pro" w:eastAsia="Source Sans Pro" w:hAnsi="Source Sans Pro" w:cs="Source Sans Pro"/>
-          <w:color w:val="000000"/>
-          <w:sz w:val="19"/>
-          <w:szCs w:val="19"/>
-        </w:rPr>
-        <w:t>Documented audit-ready case records, capturing investigation findings, decisions, evidence notes, and corrective actions, ensuring transparent and accountable case management.</w:t>
+        <w:spacing w:before="13" w:after="47"/>
+      </w:pPr>
+      <w:r>
+        <w:rPr>
+          <w:rFonts w:ascii="Source Sans Pro" w:eastAsia="Source Sans Pro" w:hAnsi="Source Sans Pro" w:cs="Source Sans Pro"/>
+          <w:color w:val="000000"/>
+          <w:sz w:val="19"/>
+          <w:szCs w:val="19"/>
+        </w:rPr>
+        <w:t>Spotted recurring patterns across 200+ weekly cases, reducing repeat-issue investigation time by early escalation</w:t>
       </w:r>
     </w:p>
     <w:p>
@@ -495,7 +495,7 @@
         <w:pBdr>
           <w:bottom w:val="single" w:sz="6" w:space="1" w:color="000000"/>
         </w:pBdr>
-        <w:spacing w:before="20" w:after="20"/>
+        <w:spacing w:before="41" w:after="41"/>
         <w:rPr>
           <w:rFonts w:ascii="Source Sans Pro" w:eastAsia="Source Sans Pro" w:hAnsi="Source Sans Pro" w:cs="Source Sans Pro"/>
           <w:b/>
@@ -511,7 +511,7 @@
         <w:pBdr>
           <w:bottom w:val="single" w:sz="6" w:space="1" w:color="000000"/>
         </w:pBdr>
-        <w:spacing w:before="99" w:after="0"/>
+        <w:spacing w:before="185" w:after="0"/>
       </w:pPr>
       <w:r>
         <w:rPr>
@@ -542,7 +542,7 @@
             <w:szCs w:val="19"/>
             <w:u w:val="single"/>
           </w:rPr>
-          <w:t>Structured Investigation and Evidence Documentation Lab</w:t>
+          <w:t>SOC Automation and Threat Detection Lab</w:t>
         </w:r>
       </w:hyperlink>
       <w:r>
@@ -579,16 +579,16 @@
           <w:ilvl w:val="0"/>
           <w:numId w:val="2"/>
         </w:numPr>
-        <w:spacing w:before="13" w:after="30"/>
-      </w:pPr>
-      <w:r>
-        <w:rPr>
-          <w:rFonts w:ascii="Source Sans Pro" w:eastAsia="Source Sans Pro" w:hAnsi="Source Sans Pro" w:cs="Source Sans Pro"/>
-          <w:color w:val="000000"/>
-          <w:sz w:val="19"/>
-          <w:szCs w:val="19"/>
-        </w:rPr>
-        <w:t>Deployed Splunk SIEM with SPL correlation searches for brute-force detection, lateral movement, and privilege escalation; mapped TTPs to MITRE ATT&amp;CK and wrote incident report in PICERL format.</w:t>
+        <w:spacing w:before="13" w:after="47"/>
+      </w:pPr>
+      <w:r>
+        <w:rPr>
+          <w:rFonts w:ascii="Source Sans Pro" w:eastAsia="Source Sans Pro" w:hAnsi="Source Sans Pro" w:cs="Source Sans Pro"/>
+          <w:color w:val="000000"/>
+          <w:sz w:val="19"/>
+          <w:szCs w:val="19"/>
+        </w:rPr>
+        <w:t>Deployed Splunk SIEM for threat detection at home in India with SPL correlation searches for brute-force detection, lateral movement.</w:t>
       </w:r>
     </w:p>
     <w:p>
@@ -598,16 +598,16 @@
           <w:ilvl w:val="0"/>
           <w:numId w:val="2"/>
         </w:numPr>
-        <w:spacing w:before="13" w:after="30"/>
-      </w:pPr>
-      <w:r>
-        <w:rPr>
-          <w:rFonts w:ascii="Source Sans Pro" w:eastAsia="Source Sans Pro" w:hAnsi="Source Sans Pro" w:cs="Source Sans Pro"/>
-          <w:color w:val="000000"/>
-          <w:sz w:val="19"/>
-          <w:szCs w:val="19"/>
-        </w:rPr>
-        <w:t>Built automated detection pipeline: Python script ingests Splunk alerts, enriches with VirusTotal API, and dispatches Telegram notifications with CVSS-based severity classification.</w:t>
+        <w:spacing w:before="13" w:after="47"/>
+      </w:pPr>
+      <w:r>
+        <w:rPr>
+          <w:rFonts w:ascii="Source Sans Pro" w:eastAsia="Source Sans Pro" w:hAnsi="Source Sans Pro" w:cs="Source Sans Pro"/>
+          <w:color w:val="000000"/>
+          <w:sz w:val="19"/>
+          <w:szCs w:val="19"/>
+        </w:rPr>
+        <w:t>Built automated SOAR-style detection pipeline using Python, and performed TCP/IP analysis in Wireshark to detect SYN scans, DNS tunnelling.</w:t>
       </w:r>
     </w:p>
     <w:p>
@@ -617,21 +617,21 @@
           <w:ilvl w:val="0"/>
           <w:numId w:val="2"/>
         </w:numPr>
-        <w:spacing w:before="13" w:after="30"/>
-      </w:pPr>
-      <w:r>
-        <w:rPr>
-          <w:rFonts w:ascii="Source Sans Pro" w:eastAsia="Source Sans Pro" w:hAnsi="Source Sans Pro" w:cs="Source Sans Pro"/>
-          <w:color w:val="000000"/>
-          <w:sz w:val="19"/>
-          <w:szCs w:val="19"/>
-        </w:rPr>
-        <w:t>Converted detection logic to Sigma rules (detection-as-code); performed TCP/IP analysis in Wireshark to detect SYN scans, DNS tunnelling, and plaintext credential exposure on unencrypted sessions.</w:t>
-      </w:r>
-    </w:p>
-    <w:p>
-      <w:pPr>
-        <w:spacing w:before="20" w:after="20"/>
+        <w:spacing w:before="13" w:after="47"/>
+      </w:pPr>
+      <w:r>
+        <w:rPr>
+          <w:rFonts w:ascii="Source Sans Pro" w:eastAsia="Source Sans Pro" w:hAnsi="Source Sans Pro" w:cs="Source Sans Pro"/>
+          <w:color w:val="000000"/>
+          <w:sz w:val="19"/>
+          <w:szCs w:val="19"/>
+        </w:rPr>
+        <w:t>Converted detection logic to Sigma rules, and wrote PICERL incident report with severity classification, and evidence documentation for audit trail.</w:t>
+      </w:r>
+    </w:p>
+    <w:p>
+      <w:pPr>
+        <w:spacing w:before="41" w:after="41"/>
       </w:pPr>
     </w:p>
     <w:p>
@@ -651,7 +651,7 @@
             <w:szCs w:val="19"/>
             <w:u w:val="single"/>
           </w:rPr>
-          <w:t>Severity-Based Vulnerability Prioritization Engine</w:t>
+          <w:t>Vulnerability Scanner and Patch Prioritization Engine</w:t>
         </w:r>
       </w:hyperlink>
       <w:r>
@@ -688,16 +688,16 @@
           <w:ilvl w:val="0"/>
           <w:numId w:val="2"/>
         </w:numPr>
-        <w:spacing w:before="13" w:after="30"/>
-      </w:pPr>
-      <w:r>
-        <w:rPr>
-          <w:rFonts w:ascii="Source Sans Pro" w:eastAsia="Source Sans Pro" w:hAnsi="Source Sans Pro" w:cs="Source Sans Pro"/>
-          <w:color w:val="000000"/>
-          <w:sz w:val="19"/>
-          <w:szCs w:val="19"/>
-        </w:rPr>
-        <w:t>Developed automated vulnerability assessment pipeline integrating Nessus and OpenVAS REST APIs in Python, generating CVE reports with CVSS severity and EPSS context from FIRST.org API.</w:t>
+        <w:spacing w:before="13" w:after="47"/>
+      </w:pPr>
+      <w:r>
+        <w:rPr>
+          <w:rFonts w:ascii="Source Sans Pro" w:eastAsia="Source Sans Pro" w:hAnsi="Source Sans Pro" w:cs="Source Sans Pro"/>
+          <w:color w:val="000000"/>
+          <w:sz w:val="19"/>
+          <w:szCs w:val="19"/>
+        </w:rPr>
+        <w:t>Built automated vulnerability assessment pipeline integrating Nessus and OpenVAS REST APIs in Python.</w:t>
       </w:r>
     </w:p>
     <w:p>
@@ -707,16 +707,16 @@
           <w:ilvl w:val="0"/>
           <w:numId w:val="2"/>
         </w:numPr>
-        <w:spacing w:before="13" w:after="30"/>
-      </w:pPr>
-      <w:r>
-        <w:rPr>
-          <w:rFonts w:ascii="Source Sans Pro" w:eastAsia="Source Sans Pro" w:hAnsi="Source Sans Pro" w:cs="Source Sans Pro"/>
-          <w:color w:val="000000"/>
-          <w:sz w:val="19"/>
-          <w:szCs w:val="19"/>
-        </w:rPr>
-        <w:t>Developed OWASP Top 10 automated web checker to detect injection, auth, and SSRF vulnerabilities; documented SQL injection remediation.</w:t>
+        <w:spacing w:before="13" w:after="47"/>
+      </w:pPr>
+      <w:r>
+        <w:rPr>
+          <w:rFonts w:ascii="Source Sans Pro" w:eastAsia="Source Sans Pro" w:hAnsi="Source Sans Pro" w:cs="Source Sans Pro"/>
+          <w:color w:val="000000"/>
+          <w:sz w:val="19"/>
+          <w:szCs w:val="19"/>
+        </w:rPr>
+        <w:t>Developed OWASP Top 10 automated web checker that sends crafted HTTP requests to detect injection, broken auth, and SSRF vulnerabilities.</w:t>
       </w:r>
     </w:p>
     <w:p>
@@ -726,16 +726,16 @@
           <w:ilvl w:val="0"/>
           <w:numId w:val="2"/>
         </w:numPr>
-        <w:spacing w:before="13" w:after="30"/>
-      </w:pPr>
-      <w:r>
-        <w:rPr>
-          <w:rFonts w:ascii="Source Sans Pro" w:eastAsia="Source Sans Pro" w:hAnsi="Source Sans Pro" w:cs="Source Sans Pro"/>
-          <w:color w:val="000000"/>
-          <w:sz w:val="19"/>
-          <w:szCs w:val="19"/>
-        </w:rPr>
-        <w:t>Automated scan scheduling via Bash and cron; built delta-scan logic to flag newly discovered CVEs and organize patch compliance (remediation tracking) tracking evidence.</w:t>
+        <w:spacing w:before="13" w:after="47"/>
+      </w:pPr>
+      <w:r>
+        <w:rPr>
+          <w:rFonts w:ascii="Source Sans Pro" w:eastAsia="Source Sans Pro" w:hAnsi="Source Sans Pro" w:cs="Source Sans Pro"/>
+          <w:color w:val="000000"/>
+          <w:sz w:val="19"/>
+          <w:szCs w:val="19"/>
+        </w:rPr>
+        <w:t>Automated scan scheduling via Bash and cron, and built delta-scan logic to flag newly discovered CVEs.</w:t>
       </w:r>
     </w:p>
     <w:p>
@@ -743,7 +743,7 @@
         <w:pBdr>
           <w:bottom w:val="single" w:sz="6" w:space="1" w:color="000000"/>
         </w:pBdr>
-        <w:spacing w:before="20" w:after="20"/>
+        <w:spacing w:before="41" w:after="41"/>
         <w:rPr>
           <w:rFonts w:ascii="Source Sans Pro" w:eastAsia="Source Sans Pro" w:hAnsi="Source Sans Pro" w:cs="Source Sans Pro"/>
           <w:b/>
@@ -759,7 +759,7 @@
         <w:pBdr>
           <w:bottom w:val="single" w:sz="6" w:space="1" w:color="000000"/>
         </w:pBdr>
-        <w:spacing w:before="99" w:after="0"/>
+        <w:spacing w:before="185" w:after="0"/>
       </w:pPr>
       <w:r>
         <w:rPr>
@@ -775,7 +775,7 @@
     </w:p>
     <w:p>
       <w:pPr>
-        <w:spacing w:before="44" w:after="44"/>
+        <w:spacing w:before="65" w:after="65"/>
       </w:pPr>
       <w:r>
         <w:rPr>
@@ -784,20 +784,20 @@
           <w:sz w:val="19"/>
           <w:szCs w:val="19"/>
         </w:rPr>
-        <w:t xml:space="preserve">SOC Operations: </w:t>
-      </w:r>
-      <w:r>
-        <w:rPr>
-          <w:rFonts w:ascii="Source Sans Pro" w:eastAsia="Source Sans Pro" w:hAnsi="Source Sans Pro" w:cs="Source Sans Pro"/>
-          <w:sz w:val="19"/>
-          <w:szCs w:val="19"/>
-        </w:rPr>
-        <w:t>Alert triage, incident investigation, log analysis, threat detection, escalation, false positive analysis</w:t>
-      </w:r>
-    </w:p>
-    <w:p>
-      <w:pPr>
-        <w:spacing w:before="44" w:after="44"/>
+        <w:t xml:space="preserve">Security Operations: </w:t>
+      </w:r>
+      <w:r>
+        <w:rPr>
+          <w:rFonts w:ascii="Source Sans Pro" w:eastAsia="Source Sans Pro" w:hAnsi="Source Sans Pro" w:cs="Source Sans Pro"/>
+          <w:sz w:val="19"/>
+          <w:szCs w:val="19"/>
+        </w:rPr>
+        <w:t>Splunk, Wireshark, Nmap</w:t>
+      </w:r>
+    </w:p>
+    <w:p>
+      <w:pPr>
+        <w:spacing w:before="65" w:after="65"/>
       </w:pPr>
       <w:r>
         <w:rPr>
@@ -806,7 +806,7 @@
           <w:sz w:val="19"/>
           <w:szCs w:val="19"/>
         </w:rPr>
-        <w:t xml:space="preserve">SIEM &amp; Monitoring: </w:t>
+        <w:t xml:space="preserve">Threat Detection: </w:t>
       </w:r>
       <w:r>
         <w:rPr>
@@ -819,7 +819,7 @@
     </w:p>
     <w:p>
       <w:pPr>
-        <w:spacing w:before="44" w:after="44"/>
+        <w:spacing w:before="65" w:after="65"/>
       </w:pPr>
       <w:r>
         <w:rPr>
@@ -828,20 +828,20 @@
           <w:sz w:val="19"/>
           <w:szCs w:val="19"/>
         </w:rPr>
-        <w:t xml:space="preserve">Threat Intelligence: </w:t>
-      </w:r>
-      <w:r>
-        <w:rPr>
-          <w:rFonts w:ascii="Source Sans Pro" w:eastAsia="Source Sans Pro" w:hAnsi="Source Sans Pro" w:cs="Source Sans Pro"/>
-          <w:sz w:val="19"/>
-          <w:szCs w:val="19"/>
-        </w:rPr>
-        <w:t>MITRE ATT&amp;CK, IOC analysis, VirusTotal, OSINT enrichment, Cyber Kill Chain</w:t>
-      </w:r>
-    </w:p>
-    <w:p>
-      <w:pPr>
-        <w:spacing w:before="44" w:after="44"/>
+        <w:t xml:space="preserve">Vulnerability Assessment: </w:t>
+      </w:r>
+      <w:r>
+        <w:rPr>
+          <w:rFonts w:ascii="Source Sans Pro" w:eastAsia="Source Sans Pro" w:hAnsi="Source Sans Pro" w:cs="Source Sans Pro"/>
+          <w:sz w:val="19"/>
+          <w:szCs w:val="19"/>
+        </w:rPr>
+        <w:t>Nessus, OpenVAS, CVSS, EPSS</w:t>
+      </w:r>
+    </w:p>
+    <w:p>
+      <w:pPr>
+        <w:spacing w:before="65" w:after="65"/>
       </w:pPr>
       <w:r>
         <w:rPr>
@@ -850,20 +850,20 @@
           <w:sz w:val="19"/>
           <w:szCs w:val="19"/>
         </w:rPr>
-        <w:t xml:space="preserve">Systems &amp; Networking: </w:t>
-      </w:r>
-      <w:r>
-        <w:rPr>
-          <w:rFonts w:ascii="Source Sans Pro" w:eastAsia="Source Sans Pro" w:hAnsi="Source Sans Pro" w:cs="Source Sans Pro"/>
-          <w:sz w:val="19"/>
-          <w:szCs w:val="19"/>
-        </w:rPr>
-        <w:t>Windows internals, Linux fundamentals, TCP/IP, DNS, HTTP/S, firewall and IDS/IPS concepts</w:t>
-      </w:r>
-    </w:p>
-    <w:p>
-      <w:pPr>
-        <w:spacing w:before="44" w:after="44"/>
+        <w:t xml:space="preserve">Automation: </w:t>
+      </w:r>
+      <w:r>
+        <w:rPr>
+          <w:rFonts w:ascii="Source Sans Pro" w:eastAsia="Source Sans Pro" w:hAnsi="Source Sans Pro" w:cs="Source Sans Pro"/>
+          <w:sz w:val="19"/>
+          <w:szCs w:val="19"/>
+        </w:rPr>
+        <w:t>Python, Bash, Telegram bot</w:t>
+      </w:r>
+    </w:p>
+    <w:p>
+      <w:pPr>
+        <w:spacing w:before="65" w:after="65"/>
       </w:pPr>
       <w:r>
         <w:rPr>
@@ -872,15 +872,15 @@
           <w:sz w:val="19"/>
           <w:szCs w:val="19"/>
         </w:rPr>
-        <w:t xml:space="preserve">Automation: </w:t>
-      </w:r>
-      <w:r>
-        <w:rPr>
-          <w:rFonts w:ascii="Source Sans Pro" w:eastAsia="Source Sans Pro" w:hAnsi="Source Sans Pro" w:cs="Source Sans Pro"/>
-          <w:sz w:val="19"/>
-          <w:szCs w:val="19"/>
-        </w:rPr>
-        <w:t>Python, Bash (basic), regular expressions, security</w:t>
+        <w:t xml:space="preserve">Incident Response: </w:t>
+      </w:r>
+      <w:r>
+        <w:rPr>
+          <w:rFonts w:ascii="Source Sans Pro" w:eastAsia="Source Sans Pro" w:hAnsi="Source Sans Pro" w:cs="Source Sans Pro"/>
+          <w:sz w:val="19"/>
+          <w:szCs w:val="19"/>
+        </w:rPr>
+        <w:t>Python, Bash (basic), regular expressions, high-volume operations review -&gt; structured investigation, escalation, and evidence documentation</w:t>
       </w:r>
     </w:p>
     <w:p>
@@ -888,7 +888,7 @@
         <w:pBdr>
           <w:bottom w:val="single" w:sz="6" w:space="1" w:color="000000"/>
         </w:pBdr>
-        <w:spacing w:before="20" w:after="20"/>
+        <w:spacing w:before="41" w:after="41"/>
         <w:rPr>
           <w:rFonts w:ascii="Source Sans Pro" w:eastAsia="Source Sans Pro" w:hAnsi="Source Sans Pro" w:cs="Source Sans Pro"/>
           <w:b/>
@@ -904,7 +904,7 @@
         <w:pBdr>
           <w:bottom w:val="single" w:sz="6" w:space="1" w:color="000000"/>
         </w:pBdr>
-        <w:spacing w:before="99" w:after="0"/>
+        <w:spacing w:before="185" w:after="0"/>
       </w:pPr>
       <w:r>
         <w:rPr>
@@ -925,7 +925,7 @@
           <w:ilvl w:val="0"/>
           <w:numId w:val="2"/>
         </w:numPr>
-        <w:spacing w:before="13" w:after="30"/>
+        <w:spacing w:before="13" w:after="47"/>
       </w:pPr>
       <w:r>
         <w:rPr>
@@ -944,7 +944,7 @@
           <w:ilvl w:val="0"/>
           <w:numId w:val="2"/>
         </w:numPr>
-        <w:spacing w:before="13" w:after="30"/>
+        <w:spacing w:before="13" w:after="47"/>
       </w:pPr>
       <w:r>
         <w:rPr>

</xml_diff>